<commit_message>
a) b) addition to the plots
</commit_message>
<xml_diff>
--- a/draft_figs02/figures_v2.1.docx
+++ b/draft_figs02/figures_v2.1.docx
@@ -47,7 +47,7 @@
           <w:rFonts w:ascii="Times New Roman" w:hAnsi="Times New Roman"/>
           <w:sz w:val="24"/>
         </w:rPr>
-        <w:t>Fig1: Standard deviation of SLA of the tracks meeting the east coast of India for the satellite mission S3A compared between Xtrack along track products and AVISO l2p tracks.</w:t>
+        <w:t>Fig1: Standard deviation of SLA of the tracks meeting the east coast of India for the satellite mission S3A compared between Xtrack along track products and AVISO l2p tracks. The top panel shows the tracks from which mean standard deviation is calculated.</w:t>
       </w:r>
     </w:p>
     <w:p>
@@ -100,7 +100,7 @@
           <w:rFonts w:ascii="Times New Roman" w:hAnsi="Times New Roman"/>
           <w:sz w:val="24"/>
         </w:rPr>
-        <w:t>Fig2</w:t>
+        <w:t>Fig2: Time series of geostrophic zonal component (gu) derived at an intersection point which close to an OMNI buoy (BD10) overlied with buoy's zonal current. Timeseries of gu correted with ekman u component is also added.</w:t>
       </w:r>
     </w:p>
     <w:p>
@@ -153,7 +153,9 @@
           <w:rFonts w:ascii="Times New Roman" w:hAnsi="Times New Roman"/>
           <w:sz w:val="24"/>
         </w:rPr>
-        <w:t>Fig3</w:t>
+        <w:t>Fig3: a) Scatter plot of rama buoys' zonal currents versus altimetry derived</w:t>
+        <w:br/>
+        <w:t>zonal currents at nearby intersection points. b) Shows scatter plot with altimetry derived currents corrected with ekman zonal currents. c) and d) show scatter plots of OMNI currents with and without correction for Ekman zonal currents.</w:t>
       </w:r>
     </w:p>
     <w:p>
@@ -206,7 +208,7 @@
           <w:rFonts w:ascii="Times New Roman" w:hAnsi="Times New Roman"/>
           <w:sz w:val="24"/>
         </w:rPr>
-        <w:t>Fig4</w:t>
+        <w:t>Fig4: a) Scatter plot of drifters' zonal velocities versus altimetry derived velocities within 200km inshore of the coast for the satellite TP+J1+J2+J3+S6A. b) shows scatter plot with altimetry derived velocities corrected with ekman zonal velocities.</w:t>
       </w:r>
     </w:p>
     <w:p>
@@ -259,7 +261,7 @@
           <w:rFonts w:ascii="Times New Roman" w:hAnsi="Times New Roman"/>
           <w:sz w:val="24"/>
         </w:rPr>
-        <w:t>Fig5</w:t>
+        <w:t>Fig5: a) Shows the radar region of TN with a intersection point within the region. b) and c) show zonal and meridional currents of altimetry derived geostrophic currents at the intersection point along with radar zonal velocity time series.</w:t>
       </w:r>
     </w:p>
     <w:p>
@@ -312,13 +314,7 @@
           <w:rFonts w:ascii="Times New Roman" w:hAnsi="Times New Roman"/>
           <w:sz w:val="24"/>
         </w:rPr>
-        <w:t>Fig6: Climatology of cross-track geostrophic currents for the months Mar (left) and Nov (right)</w:t>
-        <w:br/>
-        <w:t>derived from the satellite mission ERS1+ERS2+ENV+SRL. Only descending tracks are shown</w:t>
-        <w:br/>
-        <w:t>since cross track direction in this case makes small angle to the slope of the local coast which means</w:t>
-        <w:br/>
-        <w:t>that cross track geostrophic velocity is approximately along shelf.</w:t>
+        <w:t>Fig6: Climatology of cross-track geostrophic currents for the months Mar (a) and Nov (b) derived from the satellite mission ERS1+ERS2+ENV+SRL. Only descending tracks are shown since cross track direction in this case makes small angle to the slope of the local coast. Thus the cross track geostrophic velocity is approximately along shelf.</w:t>
       </w:r>
     </w:p>
     <w:p>
@@ -371,9 +367,7 @@
           <w:rFonts w:ascii="Times New Roman" w:hAnsi="Times New Roman"/>
           <w:sz w:val="24"/>
         </w:rPr>
-        <w:t>Fig7: Climatological mean cross-track velocities across the width of EICC for the months March</w:t>
-        <w:br/>
-        <w:t>and November at different latitudes.</w:t>
+        <w:t>Fig7: Climatological mean cross-track velocities across the width of EICC for the months March and November at different latitudes.</w:t>
       </w:r>
     </w:p>
     <w:p>
@@ -426,9 +420,9 @@
           <w:rFonts w:ascii="Times New Roman" w:hAnsi="Times New Roman"/>
           <w:sz w:val="24"/>
         </w:rPr>
-        <w:t>Fig8: Thirty year timeseries of along shore and across shore current components at the</w:t>
+        <w:t>Fig8: a) An intersection point very close to the east coast of India belonging to the satellite mission TP+J1+J2+J3+S6A. b) and c) show thirty year timeseries of along shore and across shore current components at the</w:t>
         <w:br/>
-        <w:t>intersection of two satellite tracks (155, 116) at point along the east coast of India.</w:t>
+        <w:t>intersection of two satellite tracks (155, 116).</w:t>
       </w:r>
     </w:p>
     <w:sectPr>

</xml_diff>